<commit_message>
Update project repository links in README and user manual for consistency
</commit_message>
<xml_diff>
--- a/docs/Entrega_Final_Proyecto_MAIA.docx
+++ b/docs/Entrega_Final_Proyecto_MAIA.docx
@@ -92,20 +92,8 @@
         <w:spacing w:after="80"/>
       </w:pPr>
       <w:r>
-        <w:rPr>
-          <w:b/>
-        </w:rPr>
-        <w:t xml:space="preserve">Repositorio GitHub: </w:t>
+        <w:t>Repositorio GitHub: https://github.com/jdyepest/proyecto-flag-2026-jose-julian</w:t>
       </w:r>
-      <w:hyperlink r:id="rId9">
-        <w:r>
-          <w:rPr>
-            <w:color w:val="0563C1"/>
-            <w:u w:val="single"/>
-          </w:rPr>
-          <w:t>https://github.com/jdyepest/entrega_2_micropryecto</w:t>
-        </w:r>
-      </w:hyperlink>
     </w:p>
     <w:p>
       <w:pPr>

</xml_diff>

<commit_message>
Add demonstration video link to README and user manual for better user guidance
</commit_message>
<xml_diff>
--- a/docs/Entrega_Final_Proyecto_MAIA.docx
+++ b/docs/Entrega_Final_Proyecto_MAIA.docx
@@ -96,24 +96,17 @@
       </w:r>
     </w:p>
     <w:p>
+      <w:r>
+        <w:t>Aplicacion desplegada: http://100.52.250.51:5000/</w:t>
+      </w:r>
+    </w:p>
+    <w:p>
       <w:pPr>
         <w:spacing w:after="80"/>
       </w:pPr>
       <w:r>
-        <w:rPr>
-          <w:b/>
-        </w:rPr>
-        <w:t xml:space="preserve">Aplicacion desplegada: </w:t>
+        <w:t>Video de demostracion: https://drive.google.com/file/d/1TwTTJRdqqw3XYvbOdjid60hSO5KLIH5l/view?usp=sharing</w:t>
       </w:r>
-      <w:hyperlink r:id="rId10">
-        <w:r>
-          <w:rPr>
-            <w:color w:val="0563C1"/>
-            <w:u w:val="single"/>
-          </w:rPr>
-          <w:t>http://100.52.250.51:5000/</w:t>
-        </w:r>
-      </w:hyperlink>
     </w:p>
     <w:p>
       <w:pPr>

</xml_diff>